<commit_message>
Mise à jour du statut GitHub dans le rapport
</commit_message>
<xml_diff>
--- a/Rapport_AutoLoc.docx
+++ b/Rapport_AutoLoc.docx
@@ -793,16 +793,12 @@
     </w:p>
     <w:p>
       <w:r>
-        <w:t>Repository attendu : autoloc</w:t>
-        <w:br/>
-        <w:t>Visibilité demandée : Public</w:t>
-        <w:br/>
-        <w:t>URL : [À COMPLÉTER APRÈS CRÉATION ET VÉRIFICATION]</w:t>
+        <w:t>Repository : amine-garraoui/autoloc\nVisibilité : Public\nURL : https://github.com/amine-garraoui/autoloc</w:t>
       </w:r>
     </w:p>
     <w:p>
       <w:r>
-        <w:t>Aucune URL de dépôt n'est indiquée ici tant que le repository public n'a pas été créé et vérifié.</w:t>
+        <w:t>Le dépôt public a été créé et son URL vérifiée après le push sur main.</w:t>
       </w:r>
     </w:p>
     <w:p>
@@ -847,7 +843,7 @@
     </w:p>
     <w:p>
       <w:r>
-        <w:t>État Git au moment de la préparation : dépôt local isolé sur main, commit initial effectué. Aucun remote n’est configuré. Le compte GitHub amine-garraoui existe, mais le dépôt public amine-garraoui/autoloc n’existe pas encore (réponse 404) et aucune session GitHub CLI n’est authentifiée ; aucun push n’a été effectué.</w:t>
+        <w:t>État Git vérifié après publication : branche main synchronisée avec origin/main ; commit initial poussé. Repository public : https://github.com/amine-garraoui/autoloc.</w:t>
       </w:r>
     </w:p>
     <w:sectPr>

</xml_diff>

<commit_message>
Mise en forme du lien dans le rapport
</commit_message>
<xml_diff>
--- a/Rapport_AutoLoc.docx
+++ b/Rapport_AutoLoc.docx
@@ -793,7 +793,11 @@
     </w:p>
     <w:p>
       <w:r>
-        <w:t>Repository : amine-garraoui/autoloc\nVisibilité : Public\nURL : https://github.com/amine-garraoui/autoloc</w:t>
+        <w:t>Repository : amine-garraoui/autoloc</w:t>
+        <w:br/>
+        <w:t>Visibilite : Public</w:t>
+        <w:br/>
+        <w:t>URL : https://github.com/amine-garraoui/autoloc</w:t>
       </w:r>
     </w:p>
     <w:p>

</xml_diff>